<commit_message>
feat(templates): Word defaults for blank documents
Every new/<locale>/new.docx now starts like a blank Word document:
- body text in the theme body font (Calibri), 11 pt, 8 pt after,
  line spacing 1.08;
- Office theme: Calibri Light / Calibri and the colour scheme of
  Word 2013-2021 (accent 1 = 4472C4);
- Word's built-in styles written out explicitly (Heading 1-9 in Calibri
  Light with the Word 2016 colours, Title, Subtitle, Quote, Intense
  Quote, emphasis and reference character styles, List Paragraph,
  No Spacing, Table Grid), so the document looks the same in any Word.
Language, page size, margins, settings, latent styles and the
right-to-left paragraph default of each locale are kept. Calibri renders
with the metric-compatible Carlito (OFL, shipped in core-fonts) when it
is not installed.

Generated by tools/word-defaults/make_blank_docx.py (ElixirOffice repo).

[branding]

Assisted-by: ClaudeCode:claude-opus-5-5
Co-Authored-By: Claude Opus 5.5 <noreply@anthropic.com>
</commit_message>
<xml_diff>
--- a/new/ar-SA/new.docx
+++ b/new/ar-SA/new.docx
@@ -16,7 +16,7 @@
 </file>
 
 <file path=word/styles.xml><?xml version="1.0" encoding="utf-8"?>
-<w:styles xmlns:mc="http://schemas.openxmlformats.org/markup-compatibility/2006" xmlns:r="http://schemas.openxmlformats.org/officeDocument/2006/relationships" xmlns:w="http://schemas.openxmlformats.org/wordprocessingml/2006/main" xmlns:w14="http://schemas.microsoft.com/office/word/2010/wordml" xmlns:w15="http://schemas.microsoft.com/office/word/2012/wordml" xmlns:w16cex="http://schemas.microsoft.com/office/word/2018/wordml/cex" xmlns:w16cid="http://schemas.microsoft.com/office/word/2016/wordml/cid" xmlns:w16="http://schemas.microsoft.com/office/word/2018/wordml" xmlns:w16du="http://schemas.microsoft.com/office/word/2023/wordml/word16du" xmlns:w16sdtdh="http://schemas.microsoft.com/office/word/2020/wordml/sdtdatahash" xmlns:w16se="http://schemas.microsoft.com/office/word/2015/wordml/symex" mc:Ignorable="w14 w15 w16se w16cid w16 w16cex w16sdtdh w16du">
+<w:styles xmlns:mc="http://schemas.openxmlformats.org/markup-compatibility/2006" xmlns:r="http://schemas.openxmlformats.org/officeDocument/2006/relationships" xmlns:w="http://schemas.openxmlformats.org/wordprocessingml/2006/main" xmlns:w14="http://schemas.microsoft.com/office/word/2010/wordml" mc:Ignorable="w14">
   <w:docDefaults>
     <w:rPrDefault>
       <w:rPr>
@@ -30,7 +30,7 @@
     <w:pPrDefault>
       <w:pPr>
         <w:bidi/>
-        <w:spacing w:after="200" w:line="276" w:lineRule="auto"/>
+        <w:spacing w:after="160" w:line="259" w:lineRule="auto"/>
       </w:pPr>
     </w:pPrDefault>
   </w:docDefaults>
@@ -416,6 +416,192 @@
     <w:name w:val="Normal"/>
     <w:qFormat/>
   </w:style>
+  <w:style w:type="paragraph" w:styleId="Heading1">
+    <w:name w:val="heading 1"/>
+    <w:basedOn w:val="Normal"/>
+    <w:next w:val="Normal"/>
+    <w:link w:val="Heading1Char"/>
+    <w:uiPriority w:val="9"/>
+    <w:qFormat/>
+    <w:pPr>
+      <w:keepNext/>
+      <w:keepLines/>
+      <w:spacing w:before="240" w:after="0"/>
+      <w:outlineLvl w:val="0"/>
+    </w:pPr>
+    <w:rPr>
+      <w:rFonts w:asciiTheme="majorHAnsi" w:eastAsiaTheme="majorEastAsia" w:hAnsiTheme="majorHAnsi" w:cstheme="majorBidi"/>
+      <w:color w:val="2F5496" w:themeColor="accent1" w:themeShade="BF"/>
+      <w:sz w:val="32"/>
+      <w:szCs w:val="32"/>
+    </w:rPr>
+  </w:style>
+  <w:style w:type="paragraph" w:styleId="Heading2">
+    <w:name w:val="heading 2"/>
+    <w:basedOn w:val="Normal"/>
+    <w:next w:val="Normal"/>
+    <w:link w:val="Heading2Char"/>
+    <w:uiPriority w:val="9"/>
+    <w:unhideWhenUsed/>
+    <w:qFormat/>
+    <w:pPr>
+      <w:keepNext/>
+      <w:keepLines/>
+      <w:spacing w:before="40" w:after="0"/>
+      <w:outlineLvl w:val="1"/>
+    </w:pPr>
+    <w:rPr>
+      <w:rFonts w:asciiTheme="majorHAnsi" w:eastAsiaTheme="majorEastAsia" w:hAnsiTheme="majorHAnsi" w:cstheme="majorBidi"/>
+      <w:color w:val="2F5496" w:themeColor="accent1" w:themeShade="BF"/>
+      <w:sz w:val="26"/>
+      <w:szCs w:val="26"/>
+    </w:rPr>
+  </w:style>
+  <w:style w:type="paragraph" w:styleId="Heading3">
+    <w:name w:val="heading 3"/>
+    <w:basedOn w:val="Normal"/>
+    <w:next w:val="Normal"/>
+    <w:link w:val="Heading3Char"/>
+    <w:uiPriority w:val="9"/>
+    <w:unhideWhenUsed/>
+    <w:qFormat/>
+    <w:pPr>
+      <w:keepNext/>
+      <w:keepLines/>
+      <w:spacing w:before="40" w:after="0"/>
+      <w:outlineLvl w:val="2"/>
+    </w:pPr>
+    <w:rPr>
+      <w:rFonts w:asciiTheme="majorHAnsi" w:eastAsiaTheme="majorEastAsia" w:hAnsiTheme="majorHAnsi" w:cstheme="majorBidi"/>
+      <w:color w:val="1F3763" w:themeColor="accent1" w:themeShade="7F"/>
+      <w:sz w:val="24"/>
+      <w:szCs w:val="24"/>
+    </w:rPr>
+  </w:style>
+  <w:style w:type="paragraph" w:styleId="Heading4">
+    <w:name w:val="heading 4"/>
+    <w:basedOn w:val="Normal"/>
+    <w:next w:val="Normal"/>
+    <w:link w:val="Heading4Char"/>
+    <w:uiPriority w:val="9"/>
+    <w:unhideWhenUsed/>
+    <w:qFormat/>
+    <w:pPr>
+      <w:keepNext/>
+      <w:keepLines/>
+      <w:spacing w:before="40" w:after="0"/>
+      <w:outlineLvl w:val="3"/>
+    </w:pPr>
+    <w:rPr>
+      <w:rFonts w:asciiTheme="majorHAnsi" w:eastAsiaTheme="majorEastAsia" w:hAnsiTheme="majorHAnsi" w:cstheme="majorBidi"/>
+      <w:i/>
+      <w:iCs/>
+      <w:color w:val="2F5496" w:themeColor="accent1" w:themeShade="BF"/>
+    </w:rPr>
+  </w:style>
+  <w:style w:type="paragraph" w:styleId="Heading5">
+    <w:name w:val="heading 5"/>
+    <w:basedOn w:val="Normal"/>
+    <w:next w:val="Normal"/>
+    <w:link w:val="Heading5Char"/>
+    <w:uiPriority w:val="9"/>
+    <w:unhideWhenUsed/>
+    <w:qFormat/>
+    <w:pPr>
+      <w:keepNext/>
+      <w:keepLines/>
+      <w:spacing w:before="40" w:after="0"/>
+      <w:outlineLvl w:val="4"/>
+    </w:pPr>
+    <w:rPr>
+      <w:rFonts w:asciiTheme="majorHAnsi" w:eastAsiaTheme="majorEastAsia" w:hAnsiTheme="majorHAnsi" w:cstheme="majorBidi"/>
+      <w:color w:val="2F5496" w:themeColor="accent1" w:themeShade="BF"/>
+    </w:rPr>
+  </w:style>
+  <w:style w:type="paragraph" w:styleId="Heading6">
+    <w:name w:val="heading 6"/>
+    <w:basedOn w:val="Normal"/>
+    <w:next w:val="Normal"/>
+    <w:link w:val="Heading6Char"/>
+    <w:uiPriority w:val="9"/>
+    <w:unhideWhenUsed/>
+    <w:qFormat/>
+    <w:pPr>
+      <w:keepNext/>
+      <w:keepLines/>
+      <w:spacing w:before="40" w:after="0"/>
+      <w:outlineLvl w:val="5"/>
+    </w:pPr>
+    <w:rPr>
+      <w:rFonts w:asciiTheme="majorHAnsi" w:eastAsiaTheme="majorEastAsia" w:hAnsiTheme="majorHAnsi" w:cstheme="majorBidi"/>
+      <w:color w:val="1F3763" w:themeColor="accent1" w:themeShade="7F"/>
+    </w:rPr>
+  </w:style>
+  <w:style w:type="paragraph" w:styleId="Heading7">
+    <w:name w:val="heading 7"/>
+    <w:basedOn w:val="Normal"/>
+    <w:next w:val="Normal"/>
+    <w:link w:val="Heading7Char"/>
+    <w:uiPriority w:val="9"/>
+    <w:unhideWhenUsed/>
+    <w:qFormat/>
+    <w:pPr>
+      <w:keepNext/>
+      <w:keepLines/>
+      <w:spacing w:before="40" w:after="0"/>
+      <w:outlineLvl w:val="6"/>
+    </w:pPr>
+    <w:rPr>
+      <w:rFonts w:asciiTheme="majorHAnsi" w:eastAsiaTheme="majorEastAsia" w:hAnsiTheme="majorHAnsi" w:cstheme="majorBidi"/>
+      <w:i/>
+      <w:iCs/>
+      <w:color w:val="1F3763" w:themeColor="accent1" w:themeShade="7F"/>
+    </w:rPr>
+  </w:style>
+  <w:style w:type="paragraph" w:styleId="Heading8">
+    <w:name w:val="heading 8"/>
+    <w:basedOn w:val="Normal"/>
+    <w:next w:val="Normal"/>
+    <w:link w:val="Heading8Char"/>
+    <w:uiPriority w:val="9"/>
+    <w:unhideWhenUsed/>
+    <w:qFormat/>
+    <w:pPr>
+      <w:keepNext/>
+      <w:keepLines/>
+      <w:spacing w:before="40" w:after="0"/>
+      <w:outlineLvl w:val="7"/>
+    </w:pPr>
+    <w:rPr>
+      <w:rFonts w:asciiTheme="majorHAnsi" w:eastAsiaTheme="majorEastAsia" w:hAnsiTheme="majorHAnsi" w:cstheme="majorBidi"/>
+      <w:color w:val="272727" w:themeColor="text1" w:themeTint="D8"/>
+      <w:sz w:val="21"/>
+      <w:szCs w:val="21"/>
+    </w:rPr>
+  </w:style>
+  <w:style w:type="paragraph" w:styleId="Heading9">
+    <w:name w:val="heading 9"/>
+    <w:basedOn w:val="Normal"/>
+    <w:next w:val="Normal"/>
+    <w:link w:val="Heading9Char"/>
+    <w:uiPriority w:val="9"/>
+    <w:unhideWhenUsed/>
+    <w:qFormat/>
+    <w:pPr>
+      <w:keepNext/>
+      <w:keepLines/>
+      <w:spacing w:before="40" w:after="0"/>
+      <w:outlineLvl w:val="8"/>
+    </w:pPr>
+    <w:rPr>
+      <w:rFonts w:asciiTheme="majorHAnsi" w:eastAsiaTheme="majorEastAsia" w:hAnsiTheme="majorHAnsi" w:cstheme="majorBidi"/>
+      <w:i/>
+      <w:iCs/>
+      <w:color w:val="272727" w:themeColor="text1" w:themeTint="D8"/>
+      <w:sz w:val="21"/>
+      <w:szCs w:val="21"/>
+    </w:rPr>
+  </w:style>
   <w:style w:type="character" w:default="1" w:styleId="DefaultParagraphFont">
     <w:name w:val="Default Paragraph Font"/>
     <w:uiPriority w:val="1"/>
@@ -443,24 +629,346 @@
     <w:semiHidden/>
     <w:unhideWhenUsed/>
   </w:style>
+  <w:style w:type="character" w:customStyle="1" w:styleId="Heading1Char">
+    <w:name w:val="Heading 1 Char"/>
+    <w:basedOn w:val="DefaultParagraphFont"/>
+    <w:link w:val="Heading1"/>
+    <w:uiPriority w:val="9"/>
+    <w:rPr>
+      <w:rFonts w:asciiTheme="majorHAnsi" w:eastAsiaTheme="majorEastAsia" w:hAnsiTheme="majorHAnsi" w:cstheme="majorBidi"/>
+      <w:color w:val="2F5496" w:themeColor="accent1" w:themeShade="BF"/>
+      <w:sz w:val="32"/>
+      <w:szCs w:val="32"/>
+    </w:rPr>
+  </w:style>
+  <w:style w:type="character" w:customStyle="1" w:styleId="Heading2Char">
+    <w:name w:val="Heading 2 Char"/>
+    <w:basedOn w:val="DefaultParagraphFont"/>
+    <w:link w:val="Heading2"/>
+    <w:uiPriority w:val="9"/>
+    <w:rPr>
+      <w:rFonts w:asciiTheme="majorHAnsi" w:eastAsiaTheme="majorEastAsia" w:hAnsiTheme="majorHAnsi" w:cstheme="majorBidi"/>
+      <w:color w:val="2F5496" w:themeColor="accent1" w:themeShade="BF"/>
+      <w:sz w:val="26"/>
+      <w:szCs w:val="26"/>
+    </w:rPr>
+  </w:style>
+  <w:style w:type="character" w:customStyle="1" w:styleId="Heading3Char">
+    <w:name w:val="Heading 3 Char"/>
+    <w:basedOn w:val="DefaultParagraphFont"/>
+    <w:link w:val="Heading3"/>
+    <w:uiPriority w:val="9"/>
+    <w:rPr>
+      <w:rFonts w:asciiTheme="majorHAnsi" w:eastAsiaTheme="majorEastAsia" w:hAnsiTheme="majorHAnsi" w:cstheme="majorBidi"/>
+      <w:color w:val="1F3763" w:themeColor="accent1" w:themeShade="7F"/>
+      <w:sz w:val="24"/>
+      <w:szCs w:val="24"/>
+    </w:rPr>
+  </w:style>
+  <w:style w:type="character" w:customStyle="1" w:styleId="Heading4Char">
+    <w:name w:val="Heading 4 Char"/>
+    <w:basedOn w:val="DefaultParagraphFont"/>
+    <w:link w:val="Heading4"/>
+    <w:uiPriority w:val="9"/>
+    <w:rPr>
+      <w:rFonts w:asciiTheme="majorHAnsi" w:eastAsiaTheme="majorEastAsia" w:hAnsiTheme="majorHAnsi" w:cstheme="majorBidi"/>
+      <w:i/>
+      <w:iCs/>
+      <w:color w:val="2F5496" w:themeColor="accent1" w:themeShade="BF"/>
+    </w:rPr>
+  </w:style>
+  <w:style w:type="character" w:customStyle="1" w:styleId="Heading5Char">
+    <w:name w:val="Heading 5 Char"/>
+    <w:basedOn w:val="DefaultParagraphFont"/>
+    <w:link w:val="Heading5"/>
+    <w:uiPriority w:val="9"/>
+    <w:rPr>
+      <w:rFonts w:asciiTheme="majorHAnsi" w:eastAsiaTheme="majorEastAsia" w:hAnsiTheme="majorHAnsi" w:cstheme="majorBidi"/>
+      <w:color w:val="2F5496" w:themeColor="accent1" w:themeShade="BF"/>
+    </w:rPr>
+  </w:style>
+  <w:style w:type="character" w:customStyle="1" w:styleId="Heading6Char">
+    <w:name w:val="Heading 6 Char"/>
+    <w:basedOn w:val="DefaultParagraphFont"/>
+    <w:link w:val="Heading6"/>
+    <w:uiPriority w:val="9"/>
+    <w:rPr>
+      <w:rFonts w:asciiTheme="majorHAnsi" w:eastAsiaTheme="majorEastAsia" w:hAnsiTheme="majorHAnsi" w:cstheme="majorBidi"/>
+      <w:color w:val="1F3763" w:themeColor="accent1" w:themeShade="7F"/>
+    </w:rPr>
+  </w:style>
+  <w:style w:type="character" w:customStyle="1" w:styleId="Heading7Char">
+    <w:name w:val="Heading 7 Char"/>
+    <w:basedOn w:val="DefaultParagraphFont"/>
+    <w:link w:val="Heading7"/>
+    <w:uiPriority w:val="9"/>
+    <w:rPr>
+      <w:rFonts w:asciiTheme="majorHAnsi" w:eastAsiaTheme="majorEastAsia" w:hAnsiTheme="majorHAnsi" w:cstheme="majorBidi"/>
+      <w:i/>
+      <w:iCs/>
+      <w:color w:val="1F3763" w:themeColor="accent1" w:themeShade="7F"/>
+    </w:rPr>
+  </w:style>
+  <w:style w:type="character" w:customStyle="1" w:styleId="Heading8Char">
+    <w:name w:val="Heading 8 Char"/>
+    <w:basedOn w:val="DefaultParagraphFont"/>
+    <w:link w:val="Heading8"/>
+    <w:uiPriority w:val="9"/>
+    <w:rPr>
+      <w:rFonts w:asciiTheme="majorHAnsi" w:eastAsiaTheme="majorEastAsia" w:hAnsiTheme="majorHAnsi" w:cstheme="majorBidi"/>
+      <w:color w:val="272727" w:themeColor="text1" w:themeTint="D8"/>
+      <w:sz w:val="21"/>
+      <w:szCs w:val="21"/>
+    </w:rPr>
+  </w:style>
+  <w:style w:type="character" w:customStyle="1" w:styleId="Heading9Char">
+    <w:name w:val="Heading 9 Char"/>
+    <w:basedOn w:val="DefaultParagraphFont"/>
+    <w:link w:val="Heading9"/>
+    <w:uiPriority w:val="9"/>
+    <w:rPr>
+      <w:rFonts w:asciiTheme="majorHAnsi" w:eastAsiaTheme="majorEastAsia" w:hAnsiTheme="majorHAnsi" w:cstheme="majorBidi"/>
+      <w:i/>
+      <w:iCs/>
+      <w:color w:val="272727" w:themeColor="text1" w:themeTint="D8"/>
+      <w:sz w:val="21"/>
+      <w:szCs w:val="21"/>
+    </w:rPr>
+  </w:style>
+  <w:style w:type="paragraph" w:styleId="Title">
+    <w:name w:val="Title"/>
+    <w:basedOn w:val="Normal"/>
+    <w:next w:val="Normal"/>
+    <w:link w:val="TitleChar"/>
+    <w:uiPriority w:val="10"/>
+    <w:qFormat/>
+    <w:pPr>
+      <w:spacing w:after="0" w:line="240" w:lineRule="auto"/>
+      <w:contextualSpacing/>
+    </w:pPr>
+    <w:rPr>
+      <w:rFonts w:asciiTheme="majorHAnsi" w:eastAsiaTheme="majorEastAsia" w:hAnsiTheme="majorHAnsi" w:cstheme="majorBidi"/>
+      <w:spacing w:val="-10"/>
+      <w:kern w:val="28"/>
+      <w:sz w:val="56"/>
+      <w:szCs w:val="56"/>
+    </w:rPr>
+  </w:style>
+  <w:style w:type="character" w:customStyle="1" w:styleId="TitleChar">
+    <w:name w:val="Title Char"/>
+    <w:basedOn w:val="DefaultParagraphFont"/>
+    <w:link w:val="Title"/>
+    <w:uiPriority w:val="10"/>
+    <w:rPr>
+      <w:rFonts w:asciiTheme="majorHAnsi" w:eastAsiaTheme="majorEastAsia" w:hAnsiTheme="majorHAnsi" w:cstheme="majorBidi"/>
+      <w:spacing w:val="-10"/>
+      <w:kern w:val="28"/>
+      <w:sz w:val="56"/>
+      <w:szCs w:val="56"/>
+    </w:rPr>
+  </w:style>
+  <w:style w:type="paragraph" w:styleId="Subtitle">
+    <w:name w:val="Subtitle"/>
+    <w:basedOn w:val="Normal"/>
+    <w:next w:val="Normal"/>
+    <w:link w:val="SubtitleChar"/>
+    <w:uiPriority w:val="11"/>
+    <w:qFormat/>
+    <w:pPr>
+      <w:spacing w:after="160"/>
+    </w:pPr>
+    <w:rPr>
+      <w:rFonts w:eastAsiaTheme="minorEastAsia"/>
+      <w:color w:val="5A5A5A" w:themeColor="text1" w:themeTint="A5"/>
+      <w:spacing w:val="15"/>
+    </w:rPr>
+  </w:style>
+  <w:style w:type="character" w:customStyle="1" w:styleId="SubtitleChar">
+    <w:name w:val="Subtitle Char"/>
+    <w:basedOn w:val="DefaultParagraphFont"/>
+    <w:link w:val="Subtitle"/>
+    <w:uiPriority w:val="11"/>
+    <w:rPr>
+      <w:rFonts w:eastAsiaTheme="minorEastAsia"/>
+      <w:color w:val="5A5A5A" w:themeColor="text1" w:themeTint="A5"/>
+      <w:spacing w:val="15"/>
+    </w:rPr>
+  </w:style>
+  <w:style w:type="character" w:styleId="SubtleEmphasis">
+    <w:name w:val="Subtle Emphasis"/>
+    <w:basedOn w:val="DefaultParagraphFont"/>
+    <w:uiPriority w:val="19"/>
+    <w:qFormat/>
+    <w:rPr>
+      <w:i/>
+      <w:iCs/>
+      <w:color w:val="404040" w:themeColor="text1" w:themeTint="BF"/>
+    </w:rPr>
+  </w:style>
+  <w:style w:type="character" w:styleId="Emphasis">
+    <w:name w:val="Emphasis"/>
+    <w:basedOn w:val="DefaultParagraphFont"/>
+    <w:uiPriority w:val="20"/>
+    <w:qFormat/>
+    <w:rPr>
+      <w:i/>
+      <w:iCs/>
+    </w:rPr>
+  </w:style>
+  <w:style w:type="character" w:styleId="IntenseEmphasis">
+    <w:name w:val="Intense Emphasis"/>
+    <w:basedOn w:val="DefaultParagraphFont"/>
+    <w:uiPriority w:val="21"/>
+    <w:qFormat/>
+    <w:rPr>
+      <w:i/>
+      <w:iCs/>
+      <w:color w:val="4472C4" w:themeColor="accent1"/>
+    </w:rPr>
+  </w:style>
+  <w:style w:type="character" w:styleId="Strong">
+    <w:name w:val="Strong"/>
+    <w:basedOn w:val="DefaultParagraphFont"/>
+    <w:uiPriority w:val="22"/>
+    <w:qFormat/>
+    <w:rPr>
+      <w:b/>
+      <w:bCs/>
+    </w:rPr>
+  </w:style>
+  <w:style w:type="paragraph" w:styleId="Quote">
+    <w:name w:val="Quote"/>
+    <w:basedOn w:val="Normal"/>
+    <w:next w:val="Normal"/>
+    <w:link w:val="QuoteChar"/>
+    <w:uiPriority w:val="29"/>
+    <w:qFormat/>
+    <w:pPr>
+      <w:spacing w:before="200" w:after="160"/>
+      <w:ind w:left="864" w:right="864"/>
+      <w:jc w:val="center"/>
+    </w:pPr>
+    <w:rPr>
+      <w:i/>
+      <w:iCs/>
+      <w:color w:val="404040" w:themeColor="text1" w:themeTint="BF"/>
+    </w:rPr>
+  </w:style>
+  <w:style w:type="character" w:customStyle="1" w:styleId="QuoteChar">
+    <w:name w:val="Quote Char"/>
+    <w:basedOn w:val="DefaultParagraphFont"/>
+    <w:link w:val="Quote"/>
+    <w:uiPriority w:val="29"/>
+    <w:rPr>
+      <w:i/>
+      <w:iCs/>
+      <w:color w:val="404040" w:themeColor="text1" w:themeTint="BF"/>
+    </w:rPr>
+  </w:style>
+  <w:style w:type="paragraph" w:styleId="IntenseQuote">
+    <w:name w:val="Intense Quote"/>
+    <w:basedOn w:val="Normal"/>
+    <w:next w:val="Normal"/>
+    <w:link w:val="IntenseQuoteChar"/>
+    <w:uiPriority w:val="30"/>
+    <w:qFormat/>
+    <w:pPr>
+      <w:pBdr>
+        <w:top w:val="single" w:sz="4" w:space="10" w:color="4472C4" w:themeColor="accent1"/>
+        <w:bottom w:val="single" w:sz="4" w:space="10" w:color="4472C4" w:themeColor="accent1"/>
+      </w:pBdr>
+      <w:spacing w:before="360" w:after="360"/>
+      <w:ind w:left="864" w:right="864"/>
+      <w:jc w:val="center"/>
+    </w:pPr>
+    <w:rPr>
+      <w:i/>
+      <w:iCs/>
+      <w:color w:val="4472C4" w:themeColor="accent1"/>
+    </w:rPr>
+  </w:style>
+  <w:style w:type="character" w:customStyle="1" w:styleId="IntenseQuoteChar">
+    <w:name w:val="Intense Quote Char"/>
+    <w:basedOn w:val="DefaultParagraphFont"/>
+    <w:link w:val="IntenseQuote"/>
+    <w:uiPriority w:val="30"/>
+    <w:rPr>
+      <w:i/>
+      <w:iCs/>
+      <w:color w:val="4472C4" w:themeColor="accent1"/>
+    </w:rPr>
+  </w:style>
+  <w:style w:type="character" w:styleId="SubtleReference">
+    <w:name w:val="Subtle Reference"/>
+    <w:basedOn w:val="DefaultParagraphFont"/>
+    <w:uiPriority w:val="31"/>
+    <w:qFormat/>
+    <w:rPr>
+      <w:smallCaps/>
+      <w:color w:val="5A5A5A" w:themeColor="text1" w:themeTint="A5"/>
+    </w:rPr>
+  </w:style>
+  <w:style w:type="character" w:styleId="IntenseReference">
+    <w:name w:val="Intense Reference"/>
+    <w:basedOn w:val="DefaultParagraphFont"/>
+    <w:uiPriority w:val="32"/>
+    <w:qFormat/>
+    <w:rPr>
+      <w:b/>
+      <w:bCs/>
+      <w:smallCaps/>
+      <w:color w:val="4472C4" w:themeColor="accent1"/>
+      <w:spacing w:val="5"/>
+    </w:rPr>
+  </w:style>
+  <w:style w:type="character" w:styleId="BookTitle">
+    <w:name w:val="Book Title"/>
+    <w:basedOn w:val="DefaultParagraphFont"/>
+    <w:uiPriority w:val="33"/>
+    <w:qFormat/>
+    <w:rPr>
+      <w:b/>
+      <w:bCs/>
+      <w:i/>
+      <w:iCs/>
+      <w:spacing w:val="5"/>
+    </w:rPr>
+  </w:style>
+  <w:style w:type="paragraph" w:styleId="ListParagraph">
+    <w:name w:val="List Paragraph"/>
+    <w:basedOn w:val="Normal"/>
+    <w:uiPriority w:val="34"/>
+    <w:qFormat/>
+    <w:pPr>
+      <w:ind w:left="720"/>
+      <w:contextualSpacing/>
+    </w:pPr>
+  </w:style>
   <w:style w:type="paragraph" w:styleId="NoSpacing">
     <w:name w:val="No Spacing"/>
-    <w:basedOn w:val="Normal"/>
     <w:uiPriority w:val="1"/>
     <w:qFormat/>
     <w:pPr>
       <w:spacing w:after="0" w:line="240" w:lineRule="auto"/>
     </w:pPr>
   </w:style>
-  <w:style w:type="paragraph" w:styleId="ListParagraph">
-    <w:name w:val="List Paragraph"/>
-    <w:basedOn w:val="Normal"/>
-    <w:uiPriority w:val="34"/>
-    <w:qFormat/>
-    <w:pPr>
-      <w:ind w:left="720"/>
-      <w:contextualSpacing/>
-    </w:pPr>
+  <w:style w:type="table" w:styleId="TableGrid">
+    <w:name w:val="Table Grid"/>
+    <w:basedOn w:val="TableNormal"/>
+    <w:uiPriority w:val="39"/>
+    <w:pPr>
+      <w:spacing w:after="0" w:line="240" w:lineRule="auto"/>
+    </w:pPr>
+    <w:tblPr>
+      <w:tblBorders>
+        <w:top w:val="single" w:sz="4" w:space="0" w:color="auto"/>
+        <w:left w:val="single" w:sz="4" w:space="0" w:color="auto"/>
+        <w:bottom w:val="single" w:sz="4" w:space="0" w:color="auto"/>
+        <w:right w:val="single" w:sz="4" w:space="0" w:color="auto"/>
+        <w:insideH w:val="single" w:sz="4" w:space="0" w:color="auto"/>
+        <w:insideV w:val="single" w:sz="4" w:space="0" w:color="auto"/>
+      </w:tblBorders>
+    </w:tblPr>
   </w:style>
 </w:styles>
 </file>
@@ -468,7 +976,7 @@
 <file path=word/theme/theme1.xml><?xml version="1.0" encoding="utf-8"?>
 <a:theme xmlns:a="http://schemas.openxmlformats.org/drawingml/2006/main" name="Office Theme">
   <a:themeElements>
-    <a:clrScheme name="New Office">
+    <a:clrScheme name="Office">
       <a:dk1>
         <a:sysClr val="windowText" lastClr="000000"/>
       </a:dk1>
@@ -482,7 +990,7 @@
         <a:srgbClr val="E7E6E6"/>
       </a:lt2>
       <a:accent1>
-        <a:srgbClr val="5B9BD5"/>
+        <a:srgbClr val="4472C4"/>
       </a:accent1>
       <a:accent2>
         <a:srgbClr val="ED7D31"/>
@@ -494,7 +1002,7 @@
         <a:srgbClr val="FFC000"/>
       </a:accent4>
       <a:accent5>
-        <a:srgbClr val="4472C4"/>
+        <a:srgbClr val="5B9BD5"/>
       </a:accent5>
       <a:accent6>
         <a:srgbClr val="70AD47"/>
@@ -506,16 +1014,110 @@
         <a:srgbClr val="954F72"/>
       </a:folHlink>
     </a:clrScheme>
-    <a:fontScheme name="Office Classic 2">
+    <a:fontScheme name="Office">
       <a:majorFont>
-        <a:latin typeface="Arial"/>
-        <a:ea typeface="Arial"/>
-        <a:cs typeface="Arial"/>
+        <a:latin typeface="Calibri Light" panose="020F0302020204030204"/>
+        <a:ea typeface=""/>
+        <a:cs typeface=""/>
+        <a:font script="Jpan" typeface="游ゴシック Light"/>
+        <a:font script="Hang" typeface="맑은 고딕"/>
+        <a:font script="Hans" typeface="等线 Light"/>
+        <a:font script="Hant" typeface="新細明體"/>
+        <a:font script="Arab" typeface="Times New Roman"/>
+        <a:font script="Hebr" typeface="Times New Roman"/>
+        <a:font script="Thai" typeface="Angsana New"/>
+        <a:font script="Ethi" typeface="Nyala"/>
+        <a:font script="Beng" typeface="Vrinda"/>
+        <a:font script="Gujr" typeface="Shruti"/>
+        <a:font script="Khmr" typeface="MoolBoran"/>
+        <a:font script="Knda" typeface="Tunga"/>
+        <a:font script="Guru" typeface="Raavi"/>
+        <a:font script="Cans" typeface="Euphemia"/>
+        <a:font script="Cher" typeface="Plantagenet Cherokee"/>
+        <a:font script="Yiii" typeface="Microsoft Yi Baiti"/>
+        <a:font script="Tibt" typeface="Microsoft Himalaya"/>
+        <a:font script="Thaa" typeface="MV Boli"/>
+        <a:font script="Deva" typeface="Mangal"/>
+        <a:font script="Telu" typeface="Gautami"/>
+        <a:font script="Taml" typeface="Latha"/>
+        <a:font script="Syrc" typeface="Estrangelo Edessa"/>
+        <a:font script="Orya" typeface="Kalinga"/>
+        <a:font script="Mlym" typeface="Kartika"/>
+        <a:font script="Laoo" typeface="DokChampa"/>
+        <a:font script="Sinh" typeface="Iskoola Pota"/>
+        <a:font script="Mong" typeface="Mongolian Baiti"/>
+        <a:font script="Viet" typeface="Times New Roman"/>
+        <a:font script="Uigh" typeface="Microsoft Uighur"/>
+        <a:font script="Geor" typeface="Sylfaen"/>
+        <a:font script="Armn" typeface="Arial"/>
+        <a:font script="Bugi" typeface="Leelawadee UI"/>
+        <a:font script="Bopo" typeface="Microsoft JhengHei"/>
+        <a:font script="Java" typeface="Javanese Text"/>
+        <a:font script="Lisu" typeface="Segoe UI"/>
+        <a:font script="Mymr" typeface="Myanmar Text"/>
+        <a:font script="Nkoo" typeface="Ebrima"/>
+        <a:font script="Olck" typeface="Nirmala UI"/>
+        <a:font script="Osma" typeface="Ebrima"/>
+        <a:font script="Phag" typeface="Phagspa"/>
+        <a:font script="Syrn" typeface="Estrangelo Edessa"/>
+        <a:font script="Syrj" typeface="Estrangelo Edessa"/>
+        <a:font script="Syre" typeface="Estrangelo Edessa"/>
+        <a:font script="Sora" typeface="Nirmala UI"/>
+        <a:font script="Tale" typeface="Microsoft Tai Le"/>
+        <a:font script="Talu" typeface="Microsoft New Tai Lue"/>
+        <a:font script="Tfng" typeface="Ebrima"/>
       </a:majorFont>
       <a:minorFont>
-        <a:latin typeface="Arial"/>
-        <a:ea typeface="Arial"/>
-        <a:cs typeface="Arial"/>
+        <a:latin typeface="Calibri" panose="020F0502020204030204"/>
+        <a:ea typeface=""/>
+        <a:cs typeface=""/>
+        <a:font script="Jpan" typeface="游明朝"/>
+        <a:font script="Hang" typeface="맑은 고딕"/>
+        <a:font script="Hans" typeface="等线"/>
+        <a:font script="Hant" typeface="新細明體"/>
+        <a:font script="Arab" typeface="Arial"/>
+        <a:font script="Hebr" typeface="Arial"/>
+        <a:font script="Thai" typeface="Cordia New"/>
+        <a:font script="Ethi" typeface="Nyala"/>
+        <a:font script="Beng" typeface="Vrinda"/>
+        <a:font script="Gujr" typeface="Shruti"/>
+        <a:font script="Khmr" typeface="MoolBoran"/>
+        <a:font script="Knda" typeface="Tunga"/>
+        <a:font script="Guru" typeface="Raavi"/>
+        <a:font script="Cans" typeface="Euphemia"/>
+        <a:font script="Cher" typeface="Plantagenet Cherokee"/>
+        <a:font script="Yiii" typeface="Microsoft Yi Baiti"/>
+        <a:font script="Tibt" typeface="Microsoft Himalaya"/>
+        <a:font script="Thaa" typeface="MV Boli"/>
+        <a:font script="Deva" typeface="Mangal"/>
+        <a:font script="Telu" typeface="Gautami"/>
+        <a:font script="Taml" typeface="Latha"/>
+        <a:font script="Syrc" typeface="Estrangelo Edessa"/>
+        <a:font script="Orya" typeface="Kalinga"/>
+        <a:font script="Mlym" typeface="Kartika"/>
+        <a:font script="Laoo" typeface="DokChampa"/>
+        <a:font script="Sinh" typeface="Iskoola Pota"/>
+        <a:font script="Mong" typeface="Mongolian Baiti"/>
+        <a:font script="Viet" typeface="Arial"/>
+        <a:font script="Uigh" typeface="Microsoft Uighur"/>
+        <a:font script="Geor" typeface="Sylfaen"/>
+        <a:font script="Armn" typeface="Arial"/>
+        <a:font script="Bugi" typeface="Leelawadee UI"/>
+        <a:font script="Bopo" typeface="Microsoft JhengHei"/>
+        <a:font script="Java" typeface="Javanese Text"/>
+        <a:font script="Lisu" typeface="Segoe UI"/>
+        <a:font script="Mymr" typeface="Myanmar Text"/>
+        <a:font script="Nkoo" typeface="Ebrima"/>
+        <a:font script="Olck" typeface="Nirmala UI"/>
+        <a:font script="Osma" typeface="Ebrima"/>
+        <a:font script="Phag" typeface="Phagspa"/>
+        <a:font script="Syrn" typeface="Estrangelo Edessa"/>
+        <a:font script="Syrj" typeface="Estrangelo Edessa"/>
+        <a:font script="Syre" typeface="Estrangelo Edessa"/>
+        <a:font script="Sora" typeface="Nirmala UI"/>
+        <a:font script="Tale" typeface="Microsoft Tai Le"/>
+        <a:font script="Talu" typeface="Microsoft New Tai Lue"/>
+        <a:font script="Tfng" typeface="Ebrima"/>
       </a:minorFont>
     </a:fontScheme>
     <a:fmtScheme name="Office">

</xml_diff>